<commit_message>
Add light workbench screenshots to report
</commit_message>
<xml_diff>
--- a/output/doc/chinese_truth.docx
+++ b/output/doc/chinese_truth.docx
@@ -73,6 +73,53 @@
     <w:p>
       <w:r>
         <w:t>MailClaws 把一段真实的外部邮件往来看成一个持续推进的工作单元。系统收到新邮件后，先判断它属于哪一条外部线程，再为这条线程创建或更新一个 room。这个 room 保存当前往来的核心状态，例如参与者、附件、共享事实、阶段摘要、版本变化和最终回复候选。后续所有处理都围绕这个 room 展开。</w:t>
+      </w:r>
+    </w:p>
+    <w:p>
+      <w:pPr>
+        <w:jc w:val="center"/>
+      </w:pPr>
+      <w:r>
+        <w:drawing>
+          <wp:inline xmlns:a="http://schemas.openxmlformats.org/drawingml/2006/main" xmlns:pic="http://schemas.openxmlformats.org/drawingml/2006/picture">
+            <wp:extent cx="5940000" cy="3564000"/>
+            <wp:docPr id="1" name="Picture 1"/>
+            <wp:cNvGraphicFramePr>
+              <a:graphicFrameLocks noChangeAspect="1"/>
+            </wp:cNvGraphicFramePr>
+            <a:graphic>
+              <a:graphicData uri="http://schemas.openxmlformats.org/drawingml/2006/picture">
+                <pic:pic>
+                  <pic:nvPicPr>
+                    <pic:cNvPr id="0" name="workbench-rooms-list-light-actual.png"/>
+                    <pic:cNvPicPr/>
+                  </pic:nvPicPr>
+                  <pic:blipFill>
+                    <a:blip r:embed="rId10"/>
+                    <a:stretch>
+                      <a:fillRect/>
+                    </a:stretch>
+                  </pic:blipFill>
+                  <pic:spPr>
+                    <a:xfrm>
+                      <a:off x="0" y="0"/>
+                      <a:ext cx="5940000" cy="3564000"/>
+                    </a:xfrm>
+                    <a:prstGeom prst="rect"/>
+                  </pic:spPr>
+                </pic:pic>
+              </a:graphicData>
+            </a:graphic>
+          </wp:inline>
+        </w:drawing>
+      </w:r>
+    </w:p>
+    <w:p>
+      <w:pPr>
+        <w:jc w:val="center"/>
+      </w:pPr>
+      <w:r>
+        <w:t>图 1 浅色 Room Workbench 总览：真实 workbench 页面会先把外部来信收束成 room 列表，用户从这里进入具体房间，而不是先面对冗长的 agent 对话历史。</w:t>
       </w:r>
     </w:p>
     <w:p>
@@ -838,7 +885,7 @@
         <w:drawing>
           <wp:inline xmlns:a="http://schemas.openxmlformats.org/drawingml/2006/main" xmlns:pic="http://schemas.openxmlformats.org/drawingml/2006/picture">
             <wp:extent cx="5940000" cy="3255577"/>
-            <wp:docPr id="1" name="Picture 1"/>
+            <wp:docPr id="2" name="Picture 2"/>
             <wp:cNvGraphicFramePr>
               <a:graphicFrameLocks noChangeAspect="1"/>
             </wp:cNvGraphicFramePr>
@@ -850,7 +897,7 @@
                     <pic:cNvPicPr/>
                   </pic:nvPicPr>
                   <pic:blipFill>
-                    <a:blip r:embed="rId10"/>
+                    <a:blip r:embed="rId11"/>
                     <a:stretch>
                       <a:fillRect/>
                     </a:stretch>
@@ -874,7 +921,7 @@
         <w:jc w:val="center"/>
       </w:pPr>
       <w:r>
-        <w:t>图 1 Prompt footprint benchmark：Pre-first 在三个代表场景中分别将估算输入规模降低 59.4%、71.3% 和 79.9%。</w:t>
+        <w:t>图 2 Prompt footprint benchmark：Pre-first 在三个代表场景中分别将估算输入规模降低 59.4%、71.3% 和 79.9%。</w:t>
       </w:r>
     </w:p>
     <w:p>
@@ -896,19 +943,14 @@
       </w:r>
     </w:p>
     <w:p>
-      <w:r>
-        <w:t>这个结果有两个实际含义。第一，任务拆分是真正发生的，而不是把“多 agent”藏在一个 prompt 里。第二，最终对外结果仍然能收束成一个前台可负责的结论，用户不需要自己拼接十几个角色的原始输出。下图基于真实 demo 前端截图和 room artifact 重绘，把主责任链放在左侧，把六部通信按自上而下顺序排列在右侧，更适合在报告里直接展示“谁负责、谁回信、最后如何收束”。</w:t>
-      </w:r>
-    </w:p>
-    <w:p>
       <w:pPr>
         <w:jc w:val="center"/>
       </w:pPr>
       <w:r>
         <w:drawing>
           <wp:inline xmlns:a="http://schemas.openxmlformats.org/drawingml/2006/main" xmlns:pic="http://schemas.openxmlformats.org/drawingml/2006/picture">
-            <wp:extent cx="5940000" cy="4529250"/>
-            <wp:docPr id="2" name="Picture 2"/>
+            <wp:extent cx="5940000" cy="2384366"/>
+            <wp:docPr id="3" name="Picture 3"/>
             <wp:cNvGraphicFramePr>
               <a:graphicFrameLocks noChangeAspect="1"/>
             </wp:cNvGraphicFramePr>
@@ -916,11 +958,11 @@
               <a:graphicData uri="http://schemas.openxmlformats.org/drawingml/2006/picture">
                 <pic:pic>
                   <pic:nvPicPr>
-                    <pic:cNvPr id="0" name="results-three-provinces-communication.png"/>
+                    <pic:cNvPr id="0" name="workbench-room-light-top-crop.png"/>
                     <pic:cNvPicPr/>
                   </pic:nvPicPr>
                   <pic:blipFill>
-                    <a:blip r:embed="rId11"/>
+                    <a:blip r:embed="rId12"/>
                     <a:stretch>
                       <a:fillRect/>
                     </a:stretch>
@@ -928,7 +970,7 @@
                   <pic:spPr>
                     <a:xfrm>
                       <a:off x="0" y="0"/>
-                      <a:ext cx="5940000" cy="4529250"/>
+                      <a:ext cx="5940000" cy="2384366"/>
                     </a:xfrm>
                     <a:prstGeom prst="rect"/>
                   </pic:spPr>
@@ -944,7 +986,111 @@
         <w:jc w:val="center"/>
       </w:pPr>
       <w:r>
-        <w:t>图 2 三省六部 demo 的部门通信图：左侧是太子、中书省、门下省、尚书省到最终覆核的主责任链，右侧按自上而下顺序展示尚书省与六部之间的实际通信。</w:t>
+        <w:t>图 3 浅色 Room Workbench 详情页顶部截图：真实页面直接显示该 room 的标题、thread mail 和状态统计，外部 correspondence 与当前房间状态在同一视图里对齐。</w:t>
+      </w:r>
+    </w:p>
+    <w:p>
+      <w:r>
+        <w:t>这个结果有两个实际含义。第一，任务拆分是真正发生的，而不是把“多 agent”藏在一个 prompt 里。第二，最终对外结果仍然能收束成一个前台可负责的结论，用户不需要自己拼接十几个角色的原始输出。下图基于真实 demo 前端截图和 room artifact 重绘，把主责任链放在左侧，把六部通信按自上而下顺序排列在右侧，更适合在报告里直接展示“谁负责、谁回信、最后如何收束”。</w:t>
+      </w:r>
+    </w:p>
+    <w:p>
+      <w:pPr>
+        <w:jc w:val="center"/>
+      </w:pPr>
+      <w:r>
+        <w:drawing>
+          <wp:inline xmlns:a="http://schemas.openxmlformats.org/drawingml/2006/main" xmlns:pic="http://schemas.openxmlformats.org/drawingml/2006/picture">
+            <wp:extent cx="5940000" cy="3564000"/>
+            <wp:docPr id="4" name="Picture 4"/>
+            <wp:cNvGraphicFramePr>
+              <a:graphicFrameLocks noChangeAspect="1"/>
+            </wp:cNvGraphicFramePr>
+            <a:graphic>
+              <a:graphicData uri="http://schemas.openxmlformats.org/drawingml/2006/picture">
+                <pic:pic>
+                  <pic:nvPicPr>
+                    <pic:cNvPr id="0" name="results-three-provinces-communication.png"/>
+                    <pic:cNvPicPr/>
+                  </pic:nvPicPr>
+                  <pic:blipFill>
+                    <a:blip r:embed="rId13"/>
+                    <a:stretch>
+                      <a:fillRect/>
+                    </a:stretch>
+                  </pic:blipFill>
+                  <pic:spPr>
+                    <a:xfrm>
+                      <a:off x="0" y="0"/>
+                      <a:ext cx="5940000" cy="3564000"/>
+                    </a:xfrm>
+                    <a:prstGeom prst="rect"/>
+                  </pic:spPr>
+                </pic:pic>
+              </a:graphicData>
+            </a:graphic>
+          </wp:inline>
+        </w:drawing>
+      </w:r>
+    </w:p>
+    <w:p>
+      <w:pPr>
+        <w:jc w:val="center"/>
+      </w:pPr>
+      <w:r>
+        <w:t>图 4 三省六部 demo 的浅色部门通信图：左侧是太子、中书省、门下省、尚书省到最终覆核的主责任链，右侧按自上而下顺序展示尚书省与六部之间的实际通信。</w:t>
+      </w:r>
+    </w:p>
+    <w:p>
+      <w:r>
+        <w:t>同一个 room 的下半部分则更适合展示“可回看”的协作细节。用户可以直接看到当前参与角色、角色本地邮件以及当前收束出的内部结论，这也是 MailClaws 强调 visible collaboration 的实际界面依据。</w:t>
+      </w:r>
+    </w:p>
+    <w:p>
+      <w:pPr>
+        <w:jc w:val="center"/>
+      </w:pPr>
+      <w:r>
+        <w:drawing>
+          <wp:inline xmlns:a="http://schemas.openxmlformats.org/drawingml/2006/main" xmlns:pic="http://schemas.openxmlformats.org/drawingml/2006/picture">
+            <wp:extent cx="5940000" cy="2509859"/>
+            <wp:docPr id="5" name="Picture 5"/>
+            <wp:cNvGraphicFramePr>
+              <a:graphicFrameLocks noChangeAspect="1"/>
+            </wp:cNvGraphicFramePr>
+            <a:graphic>
+              <a:graphicData uri="http://schemas.openxmlformats.org/drawingml/2006/picture">
+                <pic:pic>
+                  <pic:nvPicPr>
+                    <pic:cNvPr id="0" name="workbench-room-light-lower-crop.png"/>
+                    <pic:cNvPicPr/>
+                  </pic:nvPicPr>
+                  <pic:blipFill>
+                    <a:blip r:embed="rId14"/>
+                    <a:stretch>
+                      <a:fillRect/>
+                    </a:stretch>
+                  </pic:blipFill>
+                  <pic:spPr>
+                    <a:xfrm>
+                      <a:off x="0" y="0"/>
+                      <a:ext cx="5940000" cy="2509859"/>
+                    </a:xfrm>
+                    <a:prstGeom prst="rect"/>
+                  </pic:spPr>
+                </pic:pic>
+              </a:graphicData>
+            </a:graphic>
+          </wp:inline>
+        </w:drawing>
+      </w:r>
+    </w:p>
+    <w:p>
+      <w:pPr>
+        <w:jc w:val="center"/>
+      </w:pPr>
+      <w:r>
+        <w:t>图 5 浅色 Room Workbench 下半部分截图：Current Agents、角色本地邮箱和内部邮件卡片都在同一页面中展开，便于回看谁参与了协作、当前结论由谁收束。</w:t>
       </w:r>
     </w:p>
     <w:p>

</xml_diff>